<commit_message>
feat: keywords to personalize the search (chips, suggestions, keyword tags on matching stories)
Co-Authored-By: Claude Opus 5.5 <noreply@anthropic.com>
</commit_message>
<xml_diff>
--- a/Worldesk_Iteration_Log.docx
+++ b/Worldesk_Iteration_Log.docx
@@ -1939,6 +1939,59 @@
           <w:rFonts w:ascii="Arial" w:hAnsi="Arial" w:eastAsia="Arial" w:cs="Arial"/>
         </w:rPr>
         <w:t xml:space="preserve">Push to GitHub and deploy to Vercel, also record the iteration log.</w:t>
+      </w:r>
+    </w:p>
+    <w:p>
+      <w:pPr>
+        <w:pStyle w:val="3"/>
+      </w:pPr>
+      <w:r>
+        <w:rPr>
+          <w:rFonts w:ascii="Arial" w:hAnsi="Arial" w:eastAsia="Arial" w:cs="Arial"/>
+        </w:rPr>
+        <w:t xml:space="preserve">25. Keywords to personalize the search</w:t>
+      </w:r>
+    </w:p>
+    <w:p>
+      <w:pPr>
+        <w:spacing w:after="100"/>
+      </w:pPr>
+      <w:r>
+        <w:rPr>
+          <w:rFonts w:ascii="Arial" w:hAnsi="Arial" w:eastAsia="Arial" w:cs="Arial"/>
+          <w:b/>
+          <w:bCs/>
+        </w:rPr>
+        <w:t xml:space="preserve">What changed: </w:t>
+      </w:r>
+      <w:r>
+        <w:rPr>
+          <w:rFonts w:ascii="Arial" w:hAnsi="Arial" w:eastAsia="Arial" w:cs="Arial"/>
+        </w:rPr>
+        <w:t xml:space="preserve">A "Keywords to track" field on the About you step (and Settings → Edit profile): type a company, product, policy or person and press Enter (or paste a comma-separated list); up to 8 keywords, with one-tap suggestions for the chosen industry. The search translates them into each market's language and ranks matching stories first, and every matching card shows an orange keyword tag. Matches are checked against the user's own list so the AI cannot invent one. In testing, 6 of 11 stories for the sample executive were tagged, and a paste bug (only the last of several keywords was kept) was found and fixed.</w:t>
+      </w:r>
+    </w:p>
+    <w:p>
+      <w:pPr>
+        <w:pStyle w:val="20"/>
+      </w:pPr>
+      <w:r>
+        <w:rPr>
+          <w:rFonts w:ascii="Arial" w:hAnsi="Arial" w:eastAsia="Arial" w:cs="Arial"/>
+        </w:rPr>
+        <w:t xml:space="preserve">PROMPT</w:t>
+      </w:r>
+    </w:p>
+    <w:p>
+      <w:pPr>
+        <w:pStyle w:val="21"/>
+        <w:spacing w:after="200"/>
+      </w:pPr>
+      <w:r>
+        <w:rPr>
+          <w:rFonts w:ascii="Arial" w:hAnsi="Arial" w:eastAsia="Arial" w:cs="Arial"/>
+        </w:rPr>
+        <w:t xml:space="preserve">I want to add a feature in the page where asking the job functions and industry. I want to add a keyword feature, where allows user to type keywords to personalize their search.</w:t>
       </w:r>
     </w:p>
     <w:sectPr>

</xml_diff>

<commit_message>
feat: ten suggested keywords per industry; keyword limit 10
Co-Authored-By: Claude Opus 5.5 <noreply@anthropic.com>
</commit_message>
<xml_diff>
--- a/Worldesk_Iteration_Log.docx
+++ b/Worldesk_Iteration_Log.docx
@@ -1992,6 +1992,18 @@
           <w:rFonts w:ascii="Arial" w:hAnsi="Arial" w:eastAsia="Arial" w:cs="Arial"/>
         </w:rPr>
         <w:t xml:space="preserve">I want to add a feature in the page where asking the job functions and industry. I want to add a keyword feature, where allows user to type keywords to personalize their search.</w:t>
+      </w:r>
+    </w:p>
+    <w:p>
+      <w:pPr>
+        <w:pStyle w:val="21"/>
+        <w:spacing w:after="200"/>
+      </w:pPr>
+      <w:r>
+        <w:rPr>
+          <w:rFonts w:ascii="Arial" w:hAnsi="Arial" w:eastAsia="Arial" w:cs="Arial"/>
+        </w:rPr>
+        <w:t xml:space="preserve">Follow-up: can you have recommended ten keywords? (Each industry now suggests 10 keywords; the limit rose from 8 to 10.)</w:t>
       </w:r>
     </w:p>
     <w:sectPr>

</xml_diff>

<commit_message>
feat: 21 industries (+Other) with ten suggested keywords each
Co-Authored-By: Claude Opus 5.5 <noreply@anthropic.com>
</commit_message>
<xml_diff>
--- a/Worldesk_Iteration_Log.docx
+++ b/Worldesk_Iteration_Log.docx
@@ -2004,6 +2004,59 @@
           <w:rFonts w:ascii="Arial" w:hAnsi="Arial" w:eastAsia="Arial" w:cs="Arial"/>
         </w:rPr>
         <w:t xml:space="preserve">Follow-up: can you have recommended ten keywords? (Each industry now suggests 10 keywords; the limit rose from 8 to 10.)</w:t>
+      </w:r>
+    </w:p>
+    <w:p>
+      <w:pPr>
+        <w:pStyle w:val="3"/>
+      </w:pPr>
+      <w:r>
+        <w:rPr>
+          <w:rFonts w:ascii="Arial" w:hAnsi="Arial" w:eastAsia="Arial" w:cs="Arial"/>
+        </w:rPr>
+        <w:t xml:space="preserve">26. Expand industries and deploy</w:t>
+      </w:r>
+    </w:p>
+    <w:p>
+      <w:pPr>
+        <w:spacing w:after="100"/>
+      </w:pPr>
+      <w:r>
+        <w:rPr>
+          <w:rFonts w:ascii="Arial" w:hAnsi="Arial" w:eastAsia="Arial" w:cs="Arial"/>
+          <w:b/>
+          <w:bCs/>
+        </w:rPr>
+        <w:t xml:space="preserve">What changed: </w:t>
+      </w:r>
+      <w:r>
+        <w:rPr>
+          <w:rFonts w:ascii="Arial" w:hAnsi="Arial" w:eastAsia="Arial" w:cs="Arial"/>
+        </w:rPr>
+        <w:t xml:space="preserve">Industries grew from 7 to 21 plus "Other" (e.g. Aerospace &amp; Defense, Chemicals &amp; Materials, Industrial Manufacturing, Transportation &amp; Logistics), each with 10 suggested keywords; the original 7 names stayed the same so saved profiles keep working. Then pushed to GitHub and redeployed worldesk.vercel.app with the keyword features.</w:t>
+      </w:r>
+    </w:p>
+    <w:p>
+      <w:pPr>
+        <w:pStyle w:val="20"/>
+      </w:pPr>
+      <w:r>
+        <w:rPr>
+          <w:rFonts w:ascii="Arial" w:hAnsi="Arial" w:eastAsia="Arial" w:cs="Arial"/>
+        </w:rPr>
+        <w:t xml:space="preserve">PROMPT</w:t>
+      </w:r>
+    </w:p>
+    <w:p>
+      <w:pPr>
+        <w:pStyle w:val="21"/>
+        <w:spacing w:after="200"/>
+      </w:pPr>
+      <w:r>
+        <w:rPr>
+          <w:rFonts w:ascii="Arial" w:hAnsi="Arial" w:eastAsia="Arial" w:cs="Arial"/>
+        </w:rPr>
+        <w:t xml:space="preserve">can you expand the industry options? Then you can deploy</w:t>
       </w:r>
     </w:p>
     <w:sectPr>

</xml_diff>